<commit_message>
fix: stabilize DOCX generation and dynamic sections
</commit_message>
<xml_diff>
--- a/public/templates/coding-protocol.docx
+++ b/public/templates/coding-protocol.docx
@@ -69,6 +69,31 @@
           <w:sz w:val="24"/>
         </w:rPr>
       </w:pPr>
+      <w:r>
+        <w:rPr>
+          <w:rFonts w:ascii="Times New Roman" w:eastAsia="Times New Roman" w:hAnsi="Times New Roman" w:cs="Times New Roman"/>
+          <w:b/>
+          <w:sz w:val="24"/>
+        </w:rPr>
+        <w:tab/>
+      </w:r>
+      <w:r>
+        <w:rPr>
+          <w:rFonts w:ascii="Times New Roman" w:eastAsia="Times New Roman" w:hAnsi="Times New Roman" w:cs="Times New Roman"/>
+          <w:b/>
+          <w:sz w:val="24"/>
+        </w:rPr>
+        <w:tab/>
+      </w:r>
+      <w:r>
+        <w:rPr>
+          <w:rFonts w:ascii="Times New Roman" w:eastAsia="Times New Roman" w:hAnsi="Times New Roman" w:cs="Times New Roman"/>
+          <w:b/>
+          <w:sz w:val="24"/>
+        </w:rPr>
+        <w:tab/>
+      </w:r>
+      <w:proofErr w:type="spellStart"/>
       <w:r>
         <w:rPr>
           <w:rFonts w:ascii="Times New Roman" w:eastAsia="Times New Roman" w:hAnsi="Times New Roman" w:cs="Times New Roman"/>
@@ -565,7 +590,7 @@
                 <w:sz w:val="24"/>
                 <w:szCs w:val="24"/>
               </w:rPr>
-              <w:t xml:space="preserve">{section1_header}</w:t>
+              <w:t xml:space="preserve">{#sections}{section_header}</w:t>
             </w:r>
           </w:p>
         </w:tc>
@@ -599,7 +624,7 @@
               <w:rPr>
                 <w:rFonts w:ascii="Times New Roman" w:hAnsi="Times New Roman"/>
               </w:rPr>
-              <w:t xml:space="preserve">{#section1_rows}{code}</w:t>
+              <w:t xml:space="preserve">{#rows}{code}</w:t>
             </w:r>
           </w:p>
         </w:tc>
@@ -671,154 +696,7 @@
                 <w:b/>
                 <w:bCs/>
               </w:rPr>
-              <w:t xml:space="preserve">{count}{/section1_rows}</w:t>
-            </w:r>
-          </w:p>
-        </w:tc>
-      </w:tr>
-      <w:tr>
-        <w:tc>
-          <w:tcPr>
-            <w:tcW w:w="9801" w:type="dxa"/>
-            <w:gridSpan w:val="3"/>
-            <w:tcBorders>
-              <w:top w:val="single" w:sz="4" w:space="0" w:color="000000"/>
-              <w:left w:val="single" w:sz="4" w:space="0" w:color="000000"/>
-              <w:bottom w:val="single" w:sz="4" w:space="0" w:color="000000"/>
-              <w:right w:val="single" w:sz="4" w:space="0" w:color="000000"/>
-            </w:tcBorders>
-            <w:shd w:val="clear" w:color="auto" w:fill="auto"/>
-            <w:tcMar>
-              <w:left w:w="108" w:type="dxa"/>
-              <w:right w:w="108" w:type="dxa"/>
-            </w:tcMar>
-            <w:vAlign w:val="center"/>
-          </w:tcPr>
-          <w:p>
-            <w:pPr>
-              <w:spacing w:after="0" w:line="240" w:lineRule="auto"/>
-              <w:jc w:val="center"/>
-              <w:rPr>
-                <w:rFonts w:ascii="Times New Roman" w:eastAsia="Times New Roman" w:hAnsi="Times New Roman" w:cs="Times New Roman"/>
-                <w:b/>
-                <w:color w:val="000000"/>
-                <w:sz w:val="24"/>
-                <w:szCs w:val="24"/>
-              </w:rPr>
-            </w:pPr>
-            <w:r>
-              <w:rPr>
-                <w:rFonts w:ascii="Times New Roman" w:eastAsia="Times New Roman" w:hAnsi="Times New Roman" w:cs="Times New Roman"/>
-                <w:b/>
-                <w:color w:val="000000"/>
-                <w:sz w:val="24"/>
-                <w:szCs w:val="24"/>
-              </w:rPr>
-              <w:t xml:space="preserve">{section2_header}</w:t>
-            </w:r>
-          </w:p>
-        </w:tc>
-      </w:tr>
-      <w:tr>
-        <w:tc>
-          <w:tcPr>
-            <w:tcW w:w="1615" w:type="dxa"/>
-            <w:tcBorders>
-              <w:top w:val="single" w:sz="4" w:space="0" w:color="auto"/>
-              <w:left w:val="single" w:sz="4" w:space="0" w:color="auto"/>
-              <w:bottom w:val="single" w:sz="4" w:space="0" w:color="auto"/>
-              <w:right w:val="single" w:sz="4" w:space="0" w:color="auto"/>
-            </w:tcBorders>
-            <w:shd w:val="clear" w:color="auto" w:fill="auto"/>
-            <w:tcMar>
-              <w:left w:w="108" w:type="dxa"/>
-              <w:right w:w="108" w:type="dxa"/>
-            </w:tcMar>
-          </w:tcPr>
-          <w:p>
-            <w:pPr>
-              <w:spacing w:after="0" w:line="240" w:lineRule="auto"/>
-              <w:jc w:val="center"/>
-              <w:rPr>
-                <w:rFonts w:ascii="Times New Roman" w:hAnsi="Times New Roman"/>
-              </w:rPr>
-            </w:pPr>
-            <w:r>
-              <w:rPr>
-                <w:rFonts w:ascii="Times New Roman" w:hAnsi="Times New Roman"/>
-              </w:rPr>
-              <w:t xml:space="preserve">{#section2_rows}{code}</w:t>
-            </w:r>
-          </w:p>
-        </w:tc>
-        <w:tc>
-          <w:tcPr>
-            <w:tcW w:w="6186" w:type="dxa"/>
-            <w:tcBorders>
-              <w:top w:val="single" w:sz="4" w:space="0" w:color="auto"/>
-              <w:left w:val="single" w:sz="4" w:space="0" w:color="auto"/>
-              <w:bottom w:val="single" w:sz="4" w:space="0" w:color="auto"/>
-              <w:right w:val="single" w:sz="4" w:space="0" w:color="auto"/>
-            </w:tcBorders>
-            <w:shd w:val="clear" w:color="auto" w:fill="auto"/>
-            <w:tcMar>
-              <w:left w:w="108" w:type="dxa"/>
-              <w:right w:w="108" w:type="dxa"/>
-            </w:tcMar>
-          </w:tcPr>
-          <w:p>
-            <w:pPr>
-              <w:autoSpaceDE w:val="0"/>
-              <w:autoSpaceDN w:val="0"/>
-              <w:adjustRightInd w:val="0"/>
-              <w:spacing w:after="0" w:line="240" w:lineRule="auto"/>
-              <w:rPr>
-                <w:rFonts w:ascii="Times New Roman" w:hAnsi="Times New Roman" w:cs="Times New Roman"/>
-                <w:color w:val="000000"/>
-                <w:sz w:val="24"/>
-                <w:szCs w:val="24"/>
-              </w:rPr>
-            </w:pPr>
-            <w:r>
-              <w:rPr>
-                <w:rFonts w:ascii="Times New Roman" w:hAnsi="Times New Roman" w:cs="Times New Roman"/>
-                <w:sz w:val="24"/>
-              </w:rPr>
-              <w:t xml:space="preserve">{name}</w:t>
-            </w:r>
-          </w:p>
-        </w:tc>
-        <w:tc>
-          <w:tcPr>
-            <w:tcW w:w="2000" w:type="dxa"/>
-            <w:tcBorders>
-              <w:top w:val="single" w:sz="4" w:space="0" w:color="auto"/>
-              <w:left w:val="single" w:sz="4" w:space="0" w:color="auto"/>
-              <w:bottom w:val="single" w:sz="4" w:space="0" w:color="auto"/>
-              <w:right w:val="single" w:sz="4" w:space="0" w:color="auto"/>
-            </w:tcBorders>
-            <w:shd w:val="clear" w:color="000000" w:fill="FFFFFF"/>
-            <w:tcMar>
-              <w:left w:w="108" w:type="dxa"/>
-              <w:right w:w="108" w:type="dxa"/>
-            </w:tcMar>
-          </w:tcPr>
-          <w:p>
-            <w:pPr>
-              <w:spacing w:after="0" w:line="240" w:lineRule="auto"/>
-              <w:jc w:val="center"/>
-              <w:rPr>
-                <w:rFonts w:ascii="Times New Roman" w:hAnsi="Times New Roman" w:cs="Times New Roman"/>
-                <w:b/>
-                <w:bCs/>
-              </w:rPr>
-            </w:pPr>
-            <w:r>
-              <w:rPr>
-                <w:rFonts w:ascii="Times New Roman" w:hAnsi="Times New Roman" w:cs="Times New Roman"/>
-                <w:b/>
-              </w:rPr>
-              <w:t xml:space="preserve">{count}{/section2_rows}</w:t>
+              <w:t xml:space="preserve">{count}{/rows}{/sections}</w:t>
             </w:r>
           </w:p>
         </w:tc>
@@ -856,7 +734,25 @@
                 <w:b/>
                 <w:bCs/>
               </w:rPr>
-              <w:t xml:space="preserve">Итого: {grand_total} р/м</w:t>
+              <w:t xml:space="preserve">Итого: {grand_total} </w:t>
+            </w:r>
+            <w:proofErr w:type="gramStart"/>
+            <w:r>
+              <w:rPr>
+                <w:rFonts w:ascii="Times New Roman" w:hAnsi="Times New Roman" w:cs="Times New Roman"/>
+                <w:b/>
+                <w:bCs/>
+              </w:rPr>
+              <w:t>р</w:t>
+            </w:r>
+            <w:proofErr w:type="gramEnd"/>
+            <w:r>
+              <w:rPr>
+                <w:rFonts w:ascii="Times New Roman" w:hAnsi="Times New Roman" w:cs="Times New Roman"/>
+                <w:b/>
+                <w:bCs/>
+              </w:rPr>
+              <w:t>/м</w:t>
             </w:r>
           </w:p>
         </w:tc>

</xml_diff>